<commit_message>
Rehaan AI Usage Declaration
</commit_message>
<xml_diff>
--- a/AI Usage Declaration - Rehaan Lachporia.docx
+++ b/AI Usage Declaration - Rehaan Lachporia.docx
@@ -103,7 +103,7 @@
     </w:p>
     <w:p>
       <w:pPr>
-        <w:ind w:left="720" w:first-line="-720"/>
+        <w:ind w:left="720"/>
       </w:pPr>
       <w:r>
         <w:rPr>
@@ -120,7 +120,7 @@
     </w:p>
     <w:p>
       <w:pPr>
-        <w:ind w:left="720" w:first-line="-720"/>
+        <w:ind w:left="720"/>
       </w:pPr>
       <w:r>
         <w:rPr>
@@ -137,7 +137,7 @@
     </w:p>
     <w:p>
       <w:pPr>
-        <w:ind w:left="720" w:first-line="-720"/>
+        <w:ind w:left="720"/>
       </w:pPr>
       <w:r>
         <w:rPr>
@@ -166,7 +166,7 @@
     </w:p>
     <w:p>
       <w:pPr>
-        <w:ind w:left="720" w:first-line="-720"/>
+        <w:ind w:left="720"/>
       </w:pPr>
       <w:r>
         <w:rPr>
@@ -183,24 +183,24 @@
     </w:p>
     <w:p>
       <w:pPr>
-        <w:ind w:left="720" w:first-line="-720"/>
-      </w:pPr>
-      <w:r>
-        <w:rPr>
-          <w:rFonts w:ascii="Times" w:hAnsi="Times" w:cs="Times"/>
-          <w:sz w:val="24"/>
-          <w:sz-cs w:val="24"/>
-        </w:rPr>
-        <w:t xml:space="preserve"/>
-        <w:tab/>
-        <w:t xml:space="preserve">•</w:t>
-        <w:tab/>
-        <w:t xml:space="preserve">Submission Date: April 19th 2026</w:t>
-      </w:r>
-    </w:p>
-    <w:p>
-      <w:pPr>
-        <w:ind w:left="720" w:first-line="-720"/>
+        <w:ind w:left="720"/>
+      </w:pPr>
+      <w:r>
+        <w:rPr>
+          <w:rFonts w:ascii="Times" w:hAnsi="Times" w:cs="Times"/>
+          <w:sz w:val="24"/>
+          <w:sz-cs w:val="24"/>
+        </w:rPr>
+        <w:t xml:space="preserve"/>
+        <w:tab/>
+        <w:t xml:space="preserve">•</w:t>
+        <w:tab/>
+        <w:t xml:space="preserve">Submission Date: April 19th 2026 </w:t>
+      </w:r>
+    </w:p>
+    <w:p>
+      <w:pPr>
+        <w:ind w:left="720"/>
       </w:pPr>
       <w:r>
         <w:rPr>
@@ -238,7 +238,7 @@
     </w:p>
     <w:p>
       <w:pPr>
-        <w:ind w:left="720" w:first-line="-720"/>
+        <w:ind w:left="720"/>
       </w:pPr>
       <w:r>
         <w:rPr>
@@ -255,7 +255,7 @@
     </w:p>
     <w:p>
       <w:pPr>
-        <w:ind w:left="720" w:first-line="-720"/>
+        <w:ind w:left="720"/>
       </w:pPr>
       <w:r>
         <w:rPr>
@@ -272,7 +272,7 @@
     </w:p>
     <w:p>
       <w:pPr>
-        <w:ind w:left="720" w:first-line="-720"/>
+        <w:ind w:left="720"/>
       </w:pPr>
       <w:r>
         <w:rPr>
@@ -289,7 +289,7 @@
     </w:p>
     <w:p>
       <w:pPr>
-        <w:ind w:left="720" w:first-line="-720"/>
+        <w:ind w:left="720"/>
       </w:pPr>
       <w:r>
         <w:rPr>
@@ -390,7 +390,7 @@
     </w:p>
     <w:p>
       <w:pPr>
-        <w:ind w:left="720" w:first-line="-720"/>
+        <w:ind w:left="720"/>
       </w:pPr>
       <w:r>
         <w:rPr>
@@ -407,7 +407,7 @@
     </w:p>
     <w:p>
       <w:pPr>
-        <w:ind w:left="720" w:first-line="-720"/>
+        <w:ind w:left="720"/>
       </w:pPr>
       <w:r>
         <w:rPr>
@@ -424,7 +424,7 @@
     </w:p>
     <w:p>
       <w:pPr>
-        <w:ind w:left="720" w:first-line="-720"/>
+        <w:ind w:left="720"/>
       </w:pPr>
       <w:r>
         <w:rPr>
@@ -441,7 +441,7 @@
     </w:p>
     <w:p>
       <w:pPr>
-        <w:ind w:left="720" w:first-line="-720"/>
+        <w:ind w:left="720"/>
       </w:pPr>
       <w:r>
         <w:rPr>
@@ -458,7 +458,7 @@
     </w:p>
     <w:p>
       <w:pPr>
-        <w:ind w:left="720" w:first-line="-720"/>
+        <w:ind w:left="720"/>
       </w:pPr>
       <w:r>
         <w:rPr>
@@ -475,7 +475,7 @@
     </w:p>
     <w:p>
       <w:pPr>
-        <w:ind w:left="720" w:first-line="-720"/>
+        <w:ind w:left="720"/>
       </w:pPr>
       <w:r>
         <w:rPr>
@@ -552,7 +552,7 @@
     </w:p>
     <w:p>
       <w:pPr>
-        <w:ind w:left="720" w:first-line="-720"/>
+        <w:ind w:left="720"/>
       </w:pPr>
       <w:r>
         <w:rPr>
@@ -578,7 +578,7 @@
     </w:p>
     <w:p>
       <w:pPr>
-        <w:ind w:left="720" w:first-line="-720"/>
+        <w:ind w:left="720"/>
       </w:pPr>
       <w:r>
         <w:rPr>
@@ -653,7 +653,7 @@
     </w:p>
     <w:p>
       <w:pPr>
-        <w:ind w:left="720" w:first-line="-720"/>
+        <w:ind w:left="720"/>
       </w:pPr>
       <w:r>
         <w:rPr>
@@ -670,7 +670,7 @@
     </w:p>
     <w:p>
       <w:pPr>
-        <w:ind w:left="720" w:first-line="-720"/>
+        <w:ind w:left="720"/>
       </w:pPr>
       <w:r>
         <w:rPr>
@@ -687,7 +687,7 @@
     </w:p>
     <w:p>
       <w:pPr>
-        <w:ind w:left="720" w:first-line="-720"/>
+        <w:ind w:left="720"/>
       </w:pPr>
       <w:r>
         <w:rPr>
@@ -704,7 +704,7 @@
     </w:p>
     <w:p>
       <w:pPr>
-        <w:ind w:left="720" w:first-line="-720"/>
+        <w:ind w:left="720"/>
       </w:pPr>
       <w:r>
         <w:rPr>
@@ -1033,7 +1033,7 @@
     </w:p>
     <w:p>
       <w:pPr>
-        <w:ind w:left="720" w:first-line="-720"/>
+        <w:ind w:left="720"/>
       </w:pPr>
       <w:r>
         <w:rPr>
@@ -1050,7 +1050,7 @@
     </w:p>
     <w:p>
       <w:pPr>
-        <w:ind w:left="720" w:first-line="-720"/>
+        <w:ind w:left="720"/>
       </w:pPr>
       <w:r>
         <w:rPr>

</xml_diff>